<commit_message>
Add Tested Flows and Freestyle Enhancement sections to final document
</commit_message>
<xml_diff>
--- a/final-document.docx
+++ b/final-document.docx
@@ -9267,6 +9267,1229 @@
           <w:szCs w:val="18"/>
         </w:rPr>
         <w:t xml:space="preserve"> </w:t>
+      </w:r>
+    </w:p>
+    <w:p>
+      <w:r>
+        <w:br w:type="page"/>
+      </w:r>
+    </w:p>
+    <w:p>
+      <w:pPr>
+        <w:keepNext/>
+        <w:spacing w:before="0" w:after="160"/>
+      </w:pPr>
+      <w:r>
+        <w:rPr>
+          <w:rFonts w:ascii="Aptos Display" w:hAnsi="Aptos Display"/>
+          <w:b/>
+          <w:sz w:val="28"/>
+        </w:rPr>
+        <w:t>Tested Flows</w:t>
+      </w:r>
+    </w:p>
+    <w:p>
+      <w:pPr>
+        <w:spacing w:after="200"/>
+      </w:pPr>
+      <w:r>
+        <w:rPr>
+          <w:sz w:val="24"/>
+        </w:rPr>
+        <w:t>Each of the end-to-end flows below was exercised through the web client (hosted on AWS Amplify) against the live orders-api on API Gateway. Each entry explains what happens and which AWS services are involved, followed by screenshots as evidence.</w:t>
+      </w:r>
+    </w:p>
+    <w:p>
+      <w:pPr>
+        <w:keepNext/>
+        <w:spacing w:before="280" w:after="120"/>
+      </w:pPr>
+      <w:r>
+        <w:rPr>
+          <w:rFonts w:ascii="Aptos Display" w:hAnsi="Aptos Display"/>
+          <w:b/>
+          <w:sz w:val="26"/>
+        </w:rPr>
+        <w:t>1. Create order</w:t>
+      </w:r>
+    </w:p>
+    <w:p>
+      <w:pPr>
+        <w:spacing w:after="120"/>
+      </w:pPr>
+      <w:r>
+        <w:rPr>
+          <w:sz w:val="24"/>
+        </w:rPr>
+        <w:t>Clicking “New order” sends POST /orders to API Gateway, invoking the createOrder Lambda. It validates that price and description are present, generates a UUID orderId, stamps creationDate and lastModifiedDate (UTC ISO-8601), stores the price as a DynamoDB Decimal, and writes the item to the orders table with gsiPk = “ORDER”. It returns HTTP 201 and the new card appears in the grid.</w:t>
+      </w:r>
+    </w:p>
+    <w:p>
+      <w:pPr>
+        <w:spacing w:before="80" w:after="40"/>
+        <w:jc w:val="center"/>
+      </w:pPr>
+      <w:r>
+        <w:drawing>
+          <wp:inline xmlns:a="http://schemas.openxmlformats.org/drawingml/2006/main" xmlns:pic="http://schemas.openxmlformats.org/drawingml/2006/picture">
+            <wp:extent cx="3145536" cy="2554224"/>
+            <wp:docPr id="2049453045" name="Picture 2049453045"/>
+            <wp:cNvGraphicFramePr>
+              <a:graphicFrameLocks noChangeAspect="1"/>
+            </wp:cNvGraphicFramePr>
+            <a:graphic>
+              <a:graphicData uri="http://schemas.openxmlformats.org/drawingml/2006/picture">
+                <pic:pic>
+                  <pic:nvPicPr>
+                    <pic:cNvPr id="0" name="Screenshot 2026-06-14 at 14.26.41.png"/>
+                    <pic:cNvPicPr/>
+                  </pic:nvPicPr>
+                  <pic:blipFill>
+                    <a:blip r:embed="rId16"/>
+                    <a:stretch>
+                      <a:fillRect/>
+                    </a:stretch>
+                  </pic:blipFill>
+                  <pic:spPr>
+                    <a:xfrm>
+                      <a:off x="0" y="0"/>
+                      <a:ext cx="3145536" cy="2554224"/>
+                    </a:xfrm>
+                    <a:prstGeom prst="rect"/>
+                  </pic:spPr>
+                </pic:pic>
+              </a:graphicData>
+            </a:graphic>
+          </wp:inline>
+        </w:drawing>
+      </w:r>
+    </w:p>
+    <w:p>
+      <w:pPr>
+        <w:spacing w:after="240"/>
+        <w:jc w:val="center"/>
+      </w:pPr>
+      <w:r>
+        <w:rPr>
+          <w:i/>
+          <w:color w:val="565959"/>
+          <w:sz w:val="19"/>
+        </w:rPr>
+        <w:t>Creating an order in the UI — POST /orders.</w:t>
+      </w:r>
+    </w:p>
+    <w:p>
+      <w:pPr>
+        <w:keepNext/>
+        <w:spacing w:before="280" w:after="120"/>
+      </w:pPr>
+      <w:r>
+        <w:rPr>
+          <w:rFonts w:ascii="Aptos Display" w:hAnsi="Aptos Display"/>
+          <w:b/>
+          <w:sz w:val="26"/>
+        </w:rPr>
+        <w:t>2. Get all orders</w:t>
+      </w:r>
+    </w:p>
+    <w:p>
+      <w:pPr>
+        <w:spacing w:after="120"/>
+      </w:pPr>
+      <w:r>
+        <w:rPr>
+          <w:sz w:val="24"/>
+        </w:rPr>
+        <w:t>Opening the Orders tab sends GET /orders, invoking getAllOrders. Instead of a full-table Scan it Queries the gsi-by-date GSI on gsiPk = “ORDER” (ScanIndexForward = True), paginating until all items are read, and returns { count, orders }. The client renders them as cards.</w:t>
+      </w:r>
+    </w:p>
+    <w:p>
+      <w:pPr>
+        <w:spacing w:before="80" w:after="40"/>
+        <w:jc w:val="center"/>
+      </w:pPr>
+      <w:r>
+        <w:drawing>
+          <wp:inline xmlns:a="http://schemas.openxmlformats.org/drawingml/2006/main" xmlns:pic="http://schemas.openxmlformats.org/drawingml/2006/picture">
+            <wp:extent cx="5852160" cy="3514509"/>
+            <wp:docPr id="2049453046" name="Picture 2049453046"/>
+            <wp:cNvGraphicFramePr>
+              <a:graphicFrameLocks noChangeAspect="1"/>
+            </wp:cNvGraphicFramePr>
+            <a:graphic>
+              <a:graphicData uri="http://schemas.openxmlformats.org/drawingml/2006/picture">
+                <pic:pic>
+                  <pic:nvPicPr>
+                    <pic:cNvPr id="0" name="Screenshot 2026-06-14 at 14.26.47.png"/>
+                    <pic:cNvPicPr/>
+                  </pic:nvPicPr>
+                  <pic:blipFill>
+                    <a:blip r:embed="rId17"/>
+                    <a:stretch>
+                      <a:fillRect/>
+                    </a:stretch>
+                  </pic:blipFill>
+                  <pic:spPr>
+                    <a:xfrm>
+                      <a:off x="0" y="0"/>
+                      <a:ext cx="5852160" cy="3514509"/>
+                    </a:xfrm>
+                    <a:prstGeom prst="rect"/>
+                  </pic:spPr>
+                </pic:pic>
+              </a:graphicData>
+            </a:graphic>
+          </wp:inline>
+        </w:drawing>
+      </w:r>
+    </w:p>
+    <w:p>
+      <w:pPr>
+        <w:spacing w:after="240"/>
+        <w:jc w:val="center"/>
+      </w:pPr>
+      <w:r>
+        <w:rPr>
+          <w:i/>
+          <w:color w:val="565959"/>
+          <w:sz w:val="19"/>
+        </w:rPr>
+        <w:t>All orders listed in the grid — GET /orders.</w:t>
+      </w:r>
+    </w:p>
+    <w:p>
+      <w:pPr>
+        <w:keepNext/>
+        <w:spacing w:before="280" w:after="120"/>
+      </w:pPr>
+      <w:r>
+        <w:rPr>
+          <w:rFonts w:ascii="Aptos Display" w:hAnsi="Aptos Display"/>
+          <w:b/>
+          <w:sz w:val="26"/>
+        </w:rPr>
+        <w:t>3. Get a specific order</w:t>
+      </w:r>
+    </w:p>
+    <w:p>
+      <w:pPr>
+        <w:spacing w:after="120"/>
+      </w:pPr>
+      <w:r>
+        <w:rPr>
+          <w:sz w:val="24"/>
+        </w:rPr>
+        <w:t>A single order is retrieved with GET /orders/{id}, invoking getOrder, which does a DynamoDB get_item on the orderId primary key and returns just that item (HTTP 404 if it does not exist). In the client an individual order is isolated using the search box, which filters by description or order ID.</w:t>
+      </w:r>
+    </w:p>
+    <w:p>
+      <w:pPr>
+        <w:spacing w:before="80" w:after="40"/>
+        <w:jc w:val="center"/>
+      </w:pPr>
+      <w:r>
+        <w:drawing>
+          <wp:inline xmlns:a="http://schemas.openxmlformats.org/drawingml/2006/main" xmlns:pic="http://schemas.openxmlformats.org/drawingml/2006/picture">
+            <wp:extent cx="5852160" cy="3410874"/>
+            <wp:docPr id="2049453047" name="Picture 2049453047"/>
+            <wp:cNvGraphicFramePr>
+              <a:graphicFrameLocks noChangeAspect="1"/>
+            </wp:cNvGraphicFramePr>
+            <a:graphic>
+              <a:graphicData uri="http://schemas.openxmlformats.org/drawingml/2006/picture">
+                <pic:pic>
+                  <pic:nvPicPr>
+                    <pic:cNvPr id="0" name="Screenshot 2026-06-14 at 14.27.10.png"/>
+                    <pic:cNvPicPr/>
+                  </pic:nvPicPr>
+                  <pic:blipFill>
+                    <a:blip r:embed="rId18"/>
+                    <a:stretch>
+                      <a:fillRect/>
+                    </a:stretch>
+                  </pic:blipFill>
+                  <pic:spPr>
+                    <a:xfrm>
+                      <a:off x="0" y="0"/>
+                      <a:ext cx="5852160" cy="3410874"/>
+                    </a:xfrm>
+                    <a:prstGeom prst="rect"/>
+                  </pic:spPr>
+                </pic:pic>
+              </a:graphicData>
+            </a:graphic>
+          </wp:inline>
+        </w:drawing>
+      </w:r>
+    </w:p>
+    <w:p>
+      <w:pPr>
+        <w:spacing w:after="240"/>
+        <w:jc w:val="center"/>
+      </w:pPr>
+      <w:r>
+        <w:rPr>
+          <w:i/>
+          <w:color w:val="565959"/>
+          <w:sz w:val="19"/>
+        </w:rPr>
+        <w:t>A single order isolated by its ID via search.</w:t>
+      </w:r>
+    </w:p>
+    <w:p>
+      <w:pPr>
+        <w:keepNext/>
+        <w:spacing w:before="280" w:after="120"/>
+      </w:pPr>
+      <w:r>
+        <w:rPr>
+          <w:rFonts w:ascii="Aptos Display" w:hAnsi="Aptos Display"/>
+          <w:b/>
+          <w:sz w:val="26"/>
+        </w:rPr>
+        <w:t>4. Update order</w:t>
+      </w:r>
+    </w:p>
+    <w:p>
+      <w:pPr>
+        <w:spacing w:after="120"/>
+      </w:pPr>
+      <w:r>
+        <w:rPr>
+          <w:sz w:val="24"/>
+        </w:rPr>
+        <w:t>Editing a card sends PUT /orders/{id} with the changed price and/or description, invoking updateOrder. The function confirms the order exists (404 otherwise), builds a dynamic UpdateExpression with attribute-name placeholders, refreshes lastModifiedDate, and returns the updated item (ReturnValues = ALL_NEW).</w:t>
+      </w:r>
+    </w:p>
+    <w:p>
+      <w:pPr>
+        <w:spacing w:before="80" w:after="40"/>
+        <w:jc w:val="center"/>
+      </w:pPr>
+      <w:r>
+        <w:drawing>
+          <wp:inline xmlns:a="http://schemas.openxmlformats.org/drawingml/2006/main" xmlns:pic="http://schemas.openxmlformats.org/drawingml/2006/picture">
+            <wp:extent cx="2938272" cy="2322576"/>
+            <wp:docPr id="2049453048" name="Picture 2049453048"/>
+            <wp:cNvGraphicFramePr>
+              <a:graphicFrameLocks noChangeAspect="1"/>
+            </wp:cNvGraphicFramePr>
+            <a:graphic>
+              <a:graphicData uri="http://schemas.openxmlformats.org/drawingml/2006/picture">
+                <pic:pic>
+                  <pic:nvPicPr>
+                    <pic:cNvPr id="0" name="Screenshot 2026-06-14 at 14.27.29.png"/>
+                    <pic:cNvPicPr/>
+                  </pic:nvPicPr>
+                  <pic:blipFill>
+                    <a:blip r:embed="rId19"/>
+                    <a:stretch>
+                      <a:fillRect/>
+                    </a:stretch>
+                  </pic:blipFill>
+                  <pic:spPr>
+                    <a:xfrm>
+                      <a:off x="0" y="0"/>
+                      <a:ext cx="2938272" cy="2322576"/>
+                    </a:xfrm>
+                    <a:prstGeom prst="rect"/>
+                  </pic:spPr>
+                </pic:pic>
+              </a:graphicData>
+            </a:graphic>
+          </wp:inline>
+        </w:drawing>
+      </w:r>
+    </w:p>
+    <w:p>
+      <w:pPr>
+        <w:spacing w:after="240"/>
+        <w:jc w:val="center"/>
+      </w:pPr>
+      <w:r>
+        <w:rPr>
+          <w:i/>
+          <w:color w:val="565959"/>
+          <w:sz w:val="19"/>
+        </w:rPr>
+        <w:t>Editing the order — changing the price to 300.</w:t>
+      </w:r>
+    </w:p>
+    <w:p>
+      <w:pPr>
+        <w:spacing w:before="80" w:after="40"/>
+        <w:jc w:val="center"/>
+      </w:pPr>
+      <w:r>
+        <w:drawing>
+          <wp:inline xmlns:a="http://schemas.openxmlformats.org/drawingml/2006/main" xmlns:pic="http://schemas.openxmlformats.org/drawingml/2006/picture">
+            <wp:extent cx="2377440" cy="2715022"/>
+            <wp:docPr id="2049453049" name="Picture 2049453049"/>
+            <wp:cNvGraphicFramePr>
+              <a:graphicFrameLocks noChangeAspect="1"/>
+            </wp:cNvGraphicFramePr>
+            <a:graphic>
+              <a:graphicData uri="http://schemas.openxmlformats.org/drawingml/2006/picture">
+                <pic:pic>
+                  <pic:nvPicPr>
+                    <pic:cNvPr id="0" name="Screenshot 2026-06-14 at 14.27.34.png"/>
+                    <pic:cNvPicPr/>
+                  </pic:nvPicPr>
+                  <pic:blipFill>
+                    <a:blip r:embed="rId20"/>
+                    <a:stretch>
+                      <a:fillRect/>
+                    </a:stretch>
+                  </pic:blipFill>
+                  <pic:spPr>
+                    <a:xfrm>
+                      <a:off x="0" y="0"/>
+                      <a:ext cx="2377440" cy="2715022"/>
+                    </a:xfrm>
+                    <a:prstGeom prst="rect"/>
+                  </pic:spPr>
+                </pic:pic>
+              </a:graphicData>
+            </a:graphic>
+          </wp:inline>
+        </w:drawing>
+      </w:r>
+    </w:p>
+    <w:p>
+      <w:pPr>
+        <w:spacing w:after="240"/>
+        <w:jc w:val="center"/>
+      </w:pPr>
+      <w:r>
+        <w:rPr>
+          <w:i/>
+          <w:color w:val="565959"/>
+          <w:sz w:val="19"/>
+        </w:rPr>
+        <w:t>The card showing the updated $300.00 price.</w:t>
+      </w:r>
+    </w:p>
+    <w:p>
+      <w:pPr>
+        <w:keepNext/>
+        <w:spacing w:before="280" w:after="120"/>
+      </w:pPr>
+      <w:r>
+        <w:rPr>
+          <w:rFonts w:ascii="Aptos Display" w:hAnsi="Aptos Display"/>
+          <w:b/>
+          <w:sz w:val="26"/>
+        </w:rPr>
+        <w:t>5. Delete order (immediate response)</w:t>
+      </w:r>
+    </w:p>
+    <w:p>
+      <w:pPr>
+        <w:spacing w:after="120"/>
+      </w:pPr>
+      <w:r>
+        <w:rPr>
+          <w:sz w:val="24"/>
+        </w:rPr>
+        <w:t>Deleting a card sends DELETE /orders/{id}, invoking deleteOrder. The function deletes the item from DynamoDB, then makes a fire-and-forget Step Functions StartExecution call against the delete-order-fanout state machine and returns HTTP 200 immediately — it never waits for the asynchronous SNS email + S3 backup, and a Step Functions failure can never block the delete.</w:t>
+      </w:r>
+    </w:p>
+    <w:p>
+      <w:pPr>
+        <w:spacing w:before="80" w:after="40"/>
+        <w:jc w:val="center"/>
+      </w:pPr>
+      <w:r>
+        <w:drawing>
+          <wp:inline xmlns:a="http://schemas.openxmlformats.org/drawingml/2006/main" xmlns:pic="http://schemas.openxmlformats.org/drawingml/2006/picture">
+            <wp:extent cx="3316224" cy="1645920"/>
+            <wp:docPr id="2049453050" name="Picture 2049453050"/>
+            <wp:cNvGraphicFramePr>
+              <a:graphicFrameLocks noChangeAspect="1"/>
+            </wp:cNvGraphicFramePr>
+            <a:graphic>
+              <a:graphicData uri="http://schemas.openxmlformats.org/drawingml/2006/picture">
+                <pic:pic>
+                  <pic:nvPicPr>
+                    <pic:cNvPr id="0" name="Screenshot 2026-06-14 at 14.27.41.png"/>
+                    <pic:cNvPicPr/>
+                  </pic:nvPicPr>
+                  <pic:blipFill>
+                    <a:blip r:embed="rId21"/>
+                    <a:stretch>
+                      <a:fillRect/>
+                    </a:stretch>
+                  </pic:blipFill>
+                  <pic:spPr>
+                    <a:xfrm>
+                      <a:off x="0" y="0"/>
+                      <a:ext cx="3316224" cy="1645920"/>
+                    </a:xfrm>
+                    <a:prstGeom prst="rect"/>
+                  </pic:spPr>
+                </pic:pic>
+              </a:graphicData>
+            </a:graphic>
+          </wp:inline>
+        </w:drawing>
+      </w:r>
+    </w:p>
+    <w:p>
+      <w:pPr>
+        <w:spacing w:after="240"/>
+        <w:jc w:val="center"/>
+      </w:pPr>
+      <w:r>
+        <w:rPr>
+          <w:i/>
+          <w:color w:val="565959"/>
+          <w:sz w:val="19"/>
+        </w:rPr>
+        <w:t>Delete confirmation dialog.</w:t>
+      </w:r>
+    </w:p>
+    <w:p>
+      <w:pPr>
+        <w:spacing w:before="80" w:after="40"/>
+        <w:jc w:val="center"/>
+      </w:pPr>
+      <w:r>
+        <w:drawing>
+          <wp:inline xmlns:a="http://schemas.openxmlformats.org/drawingml/2006/main" xmlns:pic="http://schemas.openxmlformats.org/drawingml/2006/picture">
+            <wp:extent cx="5852160" cy="4428438"/>
+            <wp:docPr id="2049453051" name="Picture 2049453051"/>
+            <wp:cNvGraphicFramePr>
+              <a:graphicFrameLocks noChangeAspect="1"/>
+            </wp:cNvGraphicFramePr>
+            <a:graphic>
+              <a:graphicData uri="http://schemas.openxmlformats.org/drawingml/2006/picture">
+                <pic:pic>
+                  <pic:nvPicPr>
+                    <pic:cNvPr id="0" name="Screenshot 2026-06-14 at 14.28.11.png"/>
+                    <pic:cNvPicPr/>
+                  </pic:nvPicPr>
+                  <pic:blipFill>
+                    <a:blip r:embed="rId22"/>
+                    <a:stretch>
+                      <a:fillRect/>
+                    </a:stretch>
+                  </pic:blipFill>
+                  <pic:spPr>
+                    <a:xfrm>
+                      <a:off x="0" y="0"/>
+                      <a:ext cx="5852160" cy="4428438"/>
+                    </a:xfrm>
+                    <a:prstGeom prst="rect"/>
+                  </pic:spPr>
+                </pic:pic>
+              </a:graphicData>
+            </a:graphic>
+          </wp:inline>
+        </w:drawing>
+      </w:r>
+    </w:p>
+    <w:p>
+      <w:pPr>
+        <w:spacing w:after="240"/>
+        <w:jc w:val="center"/>
+      </w:pPr>
+      <w:r>
+        <w:rPr>
+          <w:i/>
+          <w:color w:val="565959"/>
+          <w:sz w:val="19"/>
+        </w:rPr>
+        <w:t>The order is gone from the grid right away — the response did not wait for the async fan-out.</w:t>
+      </w:r>
+    </w:p>
+    <w:p>
+      <w:pPr>
+        <w:keepNext/>
+        <w:spacing w:before="280" w:after="120"/>
+      </w:pPr>
+      <w:r>
+        <w:rPr>
+          <w:rFonts w:ascii="Aptos Display" w:hAnsi="Aptos Display"/>
+          <w:b/>
+          <w:sz w:val="26"/>
+        </w:rPr>
+        <w:t>6. Email notification received after deletion</w:t>
+      </w:r>
+    </w:p>
+    <w:p>
+      <w:pPr>
+        <w:spacing w:after="120"/>
+      </w:pPr>
+      <w:r>
+        <w:rPr>
+          <w:sz w:val="24"/>
+        </w:rPr>
+        <w:t>One branch of the delete-order-fanout state machine is an SNS Publish task to the order-deleted topic. Every confirmed email subscriber receives a plain-text message — subject “Order Management — an order was deleted” — listing the deleted order’s ID, description, price and creation date, and noting that a backup was archived to S3.</w:t>
+      </w:r>
+    </w:p>
+    <w:p>
+      <w:pPr>
+        <w:spacing w:before="80" w:after="40"/>
+        <w:jc w:val="center"/>
+      </w:pPr>
+      <w:r>
+        <w:drawing>
+          <wp:inline xmlns:a="http://schemas.openxmlformats.org/drawingml/2006/main" xmlns:pic="http://schemas.openxmlformats.org/drawingml/2006/picture">
+            <wp:extent cx="5852160" cy="1827203"/>
+            <wp:docPr id="2049453052" name="Picture 2049453052"/>
+            <wp:cNvGraphicFramePr>
+              <a:graphicFrameLocks noChangeAspect="1"/>
+            </wp:cNvGraphicFramePr>
+            <a:graphic>
+              <a:graphicData uri="http://schemas.openxmlformats.org/drawingml/2006/picture">
+                <pic:pic>
+                  <pic:nvPicPr>
+                    <pic:cNvPr id="0" name="Screenshot 2026-06-14 at 14.28.23.png"/>
+                    <pic:cNvPicPr/>
+                  </pic:nvPicPr>
+                  <pic:blipFill>
+                    <a:blip r:embed="rId23"/>
+                    <a:stretch>
+                      <a:fillRect/>
+                    </a:stretch>
+                  </pic:blipFill>
+                  <pic:spPr>
+                    <a:xfrm>
+                      <a:off x="0" y="0"/>
+                      <a:ext cx="5852160" cy="1827203"/>
+                    </a:xfrm>
+                    <a:prstGeom prst="rect"/>
+                  </pic:spPr>
+                </pic:pic>
+              </a:graphicData>
+            </a:graphic>
+          </wp:inline>
+        </w:drawing>
+      </w:r>
+    </w:p>
+    <w:p>
+      <w:pPr>
+        <w:spacing w:after="240"/>
+        <w:jc w:val="center"/>
+      </w:pPr>
+      <w:r>
+        <w:rPr>
+          <w:i/>
+          <w:color w:val="565959"/>
+          <w:sz w:val="19"/>
+        </w:rPr>
+        <w:t>The SNS deletion email received by the subscriber.</w:t>
+      </w:r>
+    </w:p>
+    <w:p>
+      <w:pPr>
+        <w:keepNext/>
+        <w:spacing w:before="280" w:after="120"/>
+      </w:pPr>
+      <w:r>
+        <w:rPr>
+          <w:rFonts w:ascii="Aptos Display" w:hAnsi="Aptos Display"/>
+          <w:b/>
+          <w:sz w:val="26"/>
+        </w:rPr>
+        <w:t>7. TXT backup file created in S3 after deletion</w:t>
+      </w:r>
+    </w:p>
+    <w:p>
+      <w:pPr>
+        <w:spacing w:after="120"/>
+      </w:pPr>
+      <w:r>
+        <w:rPr>
+          <w:sz w:val="24"/>
+        </w:rPr>
+        <w:t>The second, parallel branch invokes the backupOrder Lambda, which writes the deleted order to the S3 bucket order-backups-{accountId} as order-{orderId}.txt (text/plain), one “field: value” line per attribute.</w:t>
+      </w:r>
+    </w:p>
+    <w:p>
+      <w:pPr>
+        <w:spacing w:before="80" w:after="40"/>
+        <w:jc w:val="center"/>
+      </w:pPr>
+      <w:r>
+        <w:drawing>
+          <wp:inline xmlns:a="http://schemas.openxmlformats.org/drawingml/2006/main" xmlns:pic="http://schemas.openxmlformats.org/drawingml/2006/picture">
+            <wp:extent cx="3925823" cy="1091184"/>
+            <wp:docPr id="2049453053" name="Picture 2049453053"/>
+            <wp:cNvGraphicFramePr>
+              <a:graphicFrameLocks noChangeAspect="1"/>
+            </wp:cNvGraphicFramePr>
+            <a:graphic>
+              <a:graphicData uri="http://schemas.openxmlformats.org/drawingml/2006/picture">
+                <pic:pic>
+                  <pic:nvPicPr>
+                    <pic:cNvPr id="0" name="Screenshot 2026-06-14 at 14.30.53.png"/>
+                    <pic:cNvPicPr/>
+                  </pic:nvPicPr>
+                  <pic:blipFill>
+                    <a:blip r:embed="rId24"/>
+                    <a:stretch>
+                      <a:fillRect/>
+                    </a:stretch>
+                  </pic:blipFill>
+                  <pic:spPr>
+                    <a:xfrm>
+                      <a:off x="0" y="0"/>
+                      <a:ext cx="3925823" cy="1091184"/>
+                    </a:xfrm>
+                    <a:prstGeom prst="rect"/>
+                  </pic:spPr>
+                </pic:pic>
+              </a:graphicData>
+            </a:graphic>
+          </wp:inline>
+        </w:drawing>
+      </w:r>
+    </w:p>
+    <w:p>
+      <w:pPr>
+        <w:spacing w:after="240"/>
+        <w:jc w:val="center"/>
+      </w:pPr>
+      <w:r>
+        <w:rPr>
+          <w:i/>
+          <w:color w:val="565959"/>
+          <w:sz w:val="19"/>
+        </w:rPr>
+        <w:t>The order-&lt;id&gt;.txt backup object written to S3 by backupOrder, and its contents.</w:t>
+      </w:r>
+    </w:p>
+    <w:p>
+      <w:pPr>
+        <w:keepNext/>
+        <w:spacing w:before="280" w:after="120"/>
+      </w:pPr>
+      <w:r>
+        <w:rPr>
+          <w:rFonts w:ascii="Aptos Display" w:hAnsi="Aptos Display"/>
+          <w:b/>
+          <w:sz w:val="26"/>
+        </w:rPr>
+        <w:t>8. Register email for notifications</w:t>
+      </w:r>
+    </w:p>
+    <w:p>
+      <w:pPr>
+        <w:spacing w:after="120"/>
+      </w:pPr>
+      <w:r>
+        <w:rPr>
+          <w:sz w:val="24"/>
+        </w:rPr>
+        <w:t>On the Notifications tab, Subscribe sends POST /subscribe, invoking subscribeNotification. It resolves the order-deleted topic ARN and calls SNS Subscribe (email protocol), returning HTTP 201 with a subscriptionArn (PendingConfirmation until the recipient clicks the AWS confirmation link).</w:t>
+      </w:r>
+    </w:p>
+    <w:p>
+      <w:pPr>
+        <w:spacing w:before="80" w:after="40"/>
+        <w:jc w:val="center"/>
+      </w:pPr>
+      <w:r>
+        <w:drawing>
+          <wp:inline xmlns:a="http://schemas.openxmlformats.org/drawingml/2006/main" xmlns:pic="http://schemas.openxmlformats.org/drawingml/2006/picture">
+            <wp:extent cx="5852160" cy="772099"/>
+            <wp:docPr id="2049453054" name="Picture 2049453054"/>
+            <wp:cNvGraphicFramePr>
+              <a:graphicFrameLocks noChangeAspect="1"/>
+            </wp:cNvGraphicFramePr>
+            <a:graphic>
+              <a:graphicData uri="http://schemas.openxmlformats.org/drawingml/2006/picture">
+                <pic:pic>
+                  <pic:nvPicPr>
+                    <pic:cNvPr id="0" name="Screenshot 2026-06-14 at 14.25.25.png"/>
+                    <pic:cNvPicPr/>
+                  </pic:nvPicPr>
+                  <pic:blipFill>
+                    <a:blip r:embed="rId25"/>
+                    <a:stretch>
+                      <a:fillRect/>
+                    </a:stretch>
+                  </pic:blipFill>
+                  <pic:spPr>
+                    <a:xfrm>
+                      <a:off x="0" y="0"/>
+                      <a:ext cx="5852160" cy="772099"/>
+                    </a:xfrm>
+                    <a:prstGeom prst="rect"/>
+                  </pic:spPr>
+                </pic:pic>
+              </a:graphicData>
+            </a:graphic>
+          </wp:inline>
+        </w:drawing>
+      </w:r>
+    </w:p>
+    <w:p>
+      <w:pPr>
+        <w:spacing w:after="240"/>
+        <w:jc w:val="center"/>
+      </w:pPr>
+      <w:r>
+        <w:rPr>
+          <w:i/>
+          <w:color w:val="565959"/>
+          <w:sz w:val="19"/>
+        </w:rPr>
+        <w:t>Subscribe confirmation in the UI.</w:t>
+      </w:r>
+    </w:p>
+    <w:p>
+      <w:pPr>
+        <w:spacing w:before="80" w:after="40"/>
+        <w:jc w:val="center"/>
+      </w:pPr>
+      <w:r>
+        <w:drawing>
+          <wp:inline xmlns:a="http://schemas.openxmlformats.org/drawingml/2006/main" xmlns:pic="http://schemas.openxmlformats.org/drawingml/2006/picture">
+            <wp:extent cx="5852160" cy="1086054"/>
+            <wp:docPr id="2049453055" name="Picture 2049453055"/>
+            <wp:cNvGraphicFramePr>
+              <a:graphicFrameLocks noChangeAspect="1"/>
+            </wp:cNvGraphicFramePr>
+            <a:graphic>
+              <a:graphicData uri="http://schemas.openxmlformats.org/drawingml/2006/picture">
+                <pic:pic>
+                  <pic:nvPicPr>
+                    <pic:cNvPr id="0" name="Screenshot 2026-06-14 at 14.25.50.png"/>
+                    <pic:cNvPicPr/>
+                  </pic:nvPicPr>
+                  <pic:blipFill>
+                    <a:blip r:embed="rId26"/>
+                    <a:stretch>
+                      <a:fillRect/>
+                    </a:stretch>
+                  </pic:blipFill>
+                  <pic:spPr>
+                    <a:xfrm>
+                      <a:off x="0" y="0"/>
+                      <a:ext cx="5852160" cy="1086054"/>
+                    </a:xfrm>
+                    <a:prstGeom prst="rect"/>
+                  </pic:spPr>
+                </pic:pic>
+              </a:graphicData>
+            </a:graphic>
+          </wp:inline>
+        </w:drawing>
+      </w:r>
+    </w:p>
+    <w:p>
+      <w:pPr>
+        <w:spacing w:after="240"/>
+        <w:jc w:val="center"/>
+      </w:pPr>
+      <w:r>
+        <w:rPr>
+          <w:i/>
+          <w:color w:val="565959"/>
+          <w:sz w:val="19"/>
+        </w:rPr>
+        <w:t>The AWS subscription-confirmation email for the order-deleted topic.</w:t>
+      </w:r>
+    </w:p>
+    <w:p>
+      <w:pPr>
+        <w:keepNext/>
+        <w:spacing w:before="280" w:after="120"/>
+      </w:pPr>
+      <w:r>
+        <w:rPr>
+          <w:rFonts w:ascii="Aptos Display" w:hAnsi="Aptos Display"/>
+          <w:b/>
+          <w:sz w:val="26"/>
+        </w:rPr>
+        <w:t>9. Unsubscribe from notifications</w:t>
+      </w:r>
+    </w:p>
+    <w:p>
+      <w:pPr>
+        <w:spacing w:after="120"/>
+      </w:pPr>
+      <w:r>
+        <w:rPr>
+          <w:sz w:val="24"/>
+        </w:rPr>
+        <w:t>Unsubscribe sends DELETE /unsubscribe, invoking unsubscribeNotification, which finds the subscription ARN(s) matching the email on the topic and calls SNS Unsubscribe. It is idempotent — with no active subscription it still returns HTTP 200 with an explanatory message.</w:t>
+      </w:r>
+    </w:p>
+    <w:p>
+      <w:pPr>
+        <w:spacing w:before="80" w:after="40"/>
+        <w:jc w:val="center"/>
+      </w:pPr>
+      <w:r>
+        <w:drawing>
+          <wp:inline xmlns:a="http://schemas.openxmlformats.org/drawingml/2006/main" xmlns:pic="http://schemas.openxmlformats.org/drawingml/2006/picture">
+            <wp:extent cx="5852160" cy="781830"/>
+            <wp:docPr id="2049453056" name="Picture 2049453056"/>
+            <wp:cNvGraphicFramePr>
+              <a:graphicFrameLocks noChangeAspect="1"/>
+            </wp:cNvGraphicFramePr>
+            <a:graphic>
+              <a:graphicData uri="http://schemas.openxmlformats.org/drawingml/2006/picture">
+                <pic:pic>
+                  <pic:nvPicPr>
+                    <pic:cNvPr id="0" name="Screenshot 2026-06-14 at 14.30.29.png"/>
+                    <pic:cNvPicPr/>
+                  </pic:nvPicPr>
+                  <pic:blipFill>
+                    <a:blip r:embed="rId27"/>
+                    <a:stretch>
+                      <a:fillRect/>
+                    </a:stretch>
+                  </pic:blipFill>
+                  <pic:spPr>
+                    <a:xfrm>
+                      <a:off x="0" y="0"/>
+                      <a:ext cx="5852160" cy="781830"/>
+                    </a:xfrm>
+                    <a:prstGeom prst="rect"/>
+                  </pic:spPr>
+                </pic:pic>
+              </a:graphicData>
+            </a:graphic>
+          </wp:inline>
+        </w:drawing>
+      </w:r>
+    </w:p>
+    <w:p>
+      <w:pPr>
+        <w:spacing w:after="240"/>
+        <w:jc w:val="center"/>
+      </w:pPr>
+      <w:r>
+        <w:rPr>
+          <w:i/>
+          <w:color w:val="565959"/>
+          <w:sz w:val="19"/>
+        </w:rPr>
+        <w:t>Unsubscribe confirmation in the UI.</w:t>
+      </w:r>
+    </w:p>
+    <w:p>
+      <w:pPr>
+        <w:keepNext/>
+        <w:spacing w:before="280" w:after="120"/>
+      </w:pPr>
+      <w:r>
+        <w:rPr>
+          <w:rFonts w:ascii="Aptos Display" w:hAnsi="Aptos Display"/>
+          <w:b/>
+          <w:sz w:val="26"/>
+        </w:rPr>
+        <w:t>10. Download PDF summary</w:t>
+      </w:r>
+    </w:p>
+    <w:p>
+      <w:pPr>
+        <w:spacing w:after="120"/>
+      </w:pPr>
+      <w:r>
+        <w:rPr>
+          <w:sz w:val="24"/>
+        </w:rPr>
+        <w:t>On the Reports tab, GET /generate-pdf invokes generatePdfSummary. It lists every .txt backup in S3, reads each, builds a PDF with reportlab (one section per deleted order), uploads it as deleted-orders-summary.pdf, and returns a pre-signed S3 URL valid for one hour, which the client opens in a new tab.</w:t>
+      </w:r>
+    </w:p>
+    <w:p>
+      <w:pPr>
+        <w:spacing w:before="80" w:after="40"/>
+        <w:jc w:val="center"/>
+      </w:pPr>
+      <w:r>
+        <w:drawing>
+          <wp:inline xmlns:a="http://schemas.openxmlformats.org/drawingml/2006/main" xmlns:pic="http://schemas.openxmlformats.org/drawingml/2006/picture">
+            <wp:extent cx="5852160" cy="7573384"/>
+            <wp:docPr id="2049453057" name="Picture 2049453057"/>
+            <wp:cNvGraphicFramePr>
+              <a:graphicFrameLocks noChangeAspect="1"/>
+            </wp:cNvGraphicFramePr>
+            <a:graphic>
+              <a:graphicData uri="http://schemas.openxmlformats.org/drawingml/2006/picture">
+                <pic:pic>
+                  <pic:nvPicPr>
+                    <pic:cNvPr id="0" name="pdf-summary-1.png"/>
+                    <pic:cNvPicPr/>
+                  </pic:nvPicPr>
+                  <pic:blipFill>
+                    <a:blip r:embed="rId28"/>
+                    <a:stretch>
+                      <a:fillRect/>
+                    </a:stretch>
+                  </pic:blipFill>
+                  <pic:spPr>
+                    <a:xfrm>
+                      <a:off x="0" y="0"/>
+                      <a:ext cx="5852160" cy="7573384"/>
+                    </a:xfrm>
+                    <a:prstGeom prst="rect"/>
+                  </pic:spPr>
+                </pic:pic>
+              </a:graphicData>
+            </a:graphic>
+          </wp:inline>
+        </w:drawing>
+      </w:r>
+    </w:p>
+    <w:p>
+      <w:pPr>
+        <w:spacing w:after="240"/>
+        <w:jc w:val="center"/>
+      </w:pPr>
+      <w:r>
+        <w:rPr>
+          <w:i/>
+          <w:color w:val="565959"/>
+          <w:sz w:val="19"/>
+        </w:rPr>
+        <w:t>The generated deleted-orders-summary.pdf returned by GET /generate-pdf — one section per deleted order.</w:t>
+      </w:r>
+    </w:p>
+    <w:p>
+      <w:r>
+        <w:br w:type="page"/>
+      </w:r>
+    </w:p>
+    <w:p>
+      <w:pPr>
+        <w:keepNext/>
+        <w:spacing w:before="0" w:after="160"/>
+      </w:pPr>
+      <w:r>
+        <w:rPr>
+          <w:rFonts w:ascii="Aptos Display" w:hAnsi="Aptos Display"/>
+          <w:b/>
+          <w:sz w:val="28"/>
+        </w:rPr>
+        <w:t>Freestyle Enhancement</w:t>
+      </w:r>
+    </w:p>
+    <w:p>
+      <w:pPr>
+        <w:keepNext/>
+        <w:spacing w:before="280" w:after="120"/>
+      </w:pPr>
+      <w:r>
+        <w:rPr>
+          <w:rFonts w:ascii="Aptos Display" w:hAnsi="Aptos Display"/>
+          <w:b/>
+          <w:sz w:val="26"/>
+        </w:rPr>
+        <w:t>AWS service added</w:t>
+      </w:r>
+    </w:p>
+    <w:p>
+      <w:pPr>
+        <w:spacing w:after="120"/>
+      </w:pPr>
+      <w:r>
+        <w:rPr>
+          <w:sz w:val="24"/>
+        </w:rPr>
+        <w:t>Amazon Rekognition. It is called from the analyzeImage Lambda behind the POST /analyze-image endpoint.</w:t>
+      </w:r>
+    </w:p>
+    <w:p>
+      <w:pPr>
+        <w:keepNext/>
+        <w:spacing w:before="280" w:after="120"/>
+      </w:pPr>
+      <w:r>
+        <w:rPr>
+          <w:rFonts w:ascii="Aptos Display" w:hAnsi="Aptos Display"/>
+          <w:b/>
+          <w:sz w:val="26"/>
+        </w:rPr>
+        <w:t>Why I chose it</w:t>
+      </w:r>
+    </w:p>
+    <w:p>
+      <w:pPr>
+        <w:spacing w:after="120"/>
+      </w:pPr>
+      <w:r>
+        <w:rPr>
+          <w:sz w:val="24"/>
+        </w:rPr>
+        <w:t>I first wanted to use Amazon Translate, but it is not available in the Learner Lab. Rekognition is available, and it fit the project well: like the rest of the system it is serverless and pay-per-use, and it lets the app do something useful with a product photo instead of only storing text.</w:t>
+      </w:r>
+    </w:p>
+    <w:p>
+      <w:pPr>
+        <w:keepNext/>
+        <w:spacing w:before="280" w:after="120"/>
+      </w:pPr>
+      <w:r>
+        <w:rPr>
+          <w:rFonts w:ascii="Aptos Display" w:hAnsi="Aptos Display"/>
+          <w:b/>
+          <w:sz w:val="26"/>
+        </w:rPr>
+        <w:t>What functionality it adds</w:t>
+      </w:r>
+    </w:p>
+    <w:p>
+      <w:pPr>
+        <w:spacing w:after="120"/>
+      </w:pPr>
+      <w:r>
+        <w:rPr>
+          <w:sz w:val="24"/>
+        </w:rPr>
+        <w:t>It adds an Image Analysis page to the client. You upload a product photo and Rekognition returns labels describing what is in it. The app takes the top labels and turns them into a suggested order description, and a “Use for new order” button drops that text into a new order. So instead of typing a description, you can create one from the photo.</w:t>
+      </w:r>
+    </w:p>
+    <w:p>
+      <w:pPr>
+        <w:keepNext/>
+        <w:spacing w:before="280" w:after="120"/>
+      </w:pPr>
+      <w:r>
+        <w:rPr>
+          <w:rFonts w:ascii="Aptos Display" w:hAnsi="Aptos Display"/>
+          <w:b/>
+          <w:sz w:val="26"/>
+        </w:rPr>
+        <w:t>How to execute and verify it</w:t>
+      </w:r>
+    </w:p>
+    <w:p>
+      <w:pPr>
+        <w:spacing w:after="120"/>
+      </w:pPr>
+      <w:r>
+        <w:rPr>
+          <w:sz w:val="24"/>
+        </w:rPr>
+        <w:t>Open the Image Analysis page in the client and upload a JPEG or PNG. The detected labels appear with their confidence scores, along with a suggested description. Click “Use for new order”, add a price, and place the order — it then shows up in the Orders list with the suggested description.</w:t>
+      </w:r>
+    </w:p>
+    <w:p>
+      <w:pPr>
+        <w:keepNext/>
+        <w:spacing w:before="280" w:after="120"/>
+      </w:pPr>
+      <w:r>
+        <w:rPr>
+          <w:rFonts w:ascii="Aptos Display" w:hAnsi="Aptos Display"/>
+          <w:b/>
+          <w:sz w:val="26"/>
+        </w:rPr>
+        <w:t>Working in the UI</w:t>
+      </w:r>
+    </w:p>
+    <w:p>
+      <w:pPr>
+        <w:spacing w:before="80" w:after="40"/>
+        <w:jc w:val="center"/>
+      </w:pPr>
+      <w:r>
+        <w:drawing>
+          <wp:inline xmlns:a="http://schemas.openxmlformats.org/drawingml/2006/main" xmlns:pic="http://schemas.openxmlformats.org/drawingml/2006/picture">
+            <wp:extent cx="5852160" cy="1601508"/>
+            <wp:docPr id="2049453058" name="Picture 2049453058"/>
+            <wp:cNvGraphicFramePr>
+              <a:graphicFrameLocks noChangeAspect="1"/>
+            </wp:cNvGraphicFramePr>
+            <a:graphic>
+              <a:graphicData uri="http://schemas.openxmlformats.org/drawingml/2006/picture">
+                <pic:pic>
+                  <pic:nvPicPr>
+                    <pic:cNvPr id="0" name="Screenshot 2026-06-14 at 14.31.35.png"/>
+                    <pic:cNvPicPr/>
+                  </pic:nvPicPr>
+                  <pic:blipFill>
+                    <a:blip r:embed="rId29"/>
+                    <a:stretch>
+                      <a:fillRect/>
+                    </a:stretch>
+                  </pic:blipFill>
+                  <pic:spPr>
+                    <a:xfrm>
+                      <a:off x="0" y="0"/>
+                      <a:ext cx="5852160" cy="1601508"/>
+                    </a:xfrm>
+                    <a:prstGeom prst="rect"/>
+                  </pic:spPr>
+                </pic:pic>
+              </a:graphicData>
+            </a:graphic>
+          </wp:inline>
+        </w:drawing>
+      </w:r>
+    </w:p>
+    <w:p>
+      <w:pPr>
+        <w:spacing w:after="240"/>
+        <w:jc w:val="center"/>
+      </w:pPr>
+      <w:r>
+        <w:rPr>
+          <w:i/>
+          <w:color w:val="565959"/>
+          <w:sz w:val="19"/>
+        </w:rPr>
+        <w:t>Uploading a watch photo: Rekognition returns the labels and a suggested description.</w:t>
+      </w:r>
+    </w:p>
+    <w:p>
+      <w:pPr>
+        <w:spacing w:before="80" w:after="40"/>
+        <w:jc w:val="center"/>
+      </w:pPr>
+      <w:r>
+        <w:drawing>
+          <wp:inline xmlns:a="http://schemas.openxmlformats.org/drawingml/2006/main" xmlns:pic="http://schemas.openxmlformats.org/drawingml/2006/picture">
+            <wp:extent cx="5852160" cy="3283145"/>
+            <wp:docPr id="2049453059" name="Picture 2049453059"/>
+            <wp:cNvGraphicFramePr>
+              <a:graphicFrameLocks noChangeAspect="1"/>
+            </wp:cNvGraphicFramePr>
+            <a:graphic>
+              <a:graphicData uri="http://schemas.openxmlformats.org/drawingml/2006/picture">
+                <pic:pic>
+                  <pic:nvPicPr>
+                    <pic:cNvPr id="0" name="Screenshot 2026-06-14 at 14.31.51.png"/>
+                    <pic:cNvPicPr/>
+                  </pic:nvPicPr>
+                  <pic:blipFill>
+                    <a:blip r:embed="rId30"/>
+                    <a:stretch>
+                      <a:fillRect/>
+                    </a:stretch>
+                  </pic:blipFill>
+                  <pic:spPr>
+                    <a:xfrm>
+                      <a:off x="0" y="0"/>
+                      <a:ext cx="5852160" cy="3283145"/>
+                    </a:xfrm>
+                    <a:prstGeom prst="rect"/>
+                  </pic:spPr>
+                </pic:pic>
+              </a:graphicData>
+            </a:graphic>
+          </wp:inline>
+        </w:drawing>
+      </w:r>
+    </w:p>
+    <w:p>
+      <w:pPr>
+        <w:spacing w:after="240"/>
+        <w:jc w:val="center"/>
+      </w:pPr>
+      <w:r>
+        <w:rPr>
+          <w:i/>
+          <w:color w:val="565959"/>
+          <w:sz w:val="19"/>
+        </w:rPr>
+        <w:t>The order created from that suggested description.</w:t>
       </w:r>
     </w:p>
     <w:sectPr>

</xml_diff>